<commit_message>
Updated latest resume - some additional details & porfessional photo.
</commit_message>
<xml_diff>
--- a/Resume and Professional Autobiography/Resume-Desi-Miteva-Nikolova-October-2026.docx
+++ b/Resume and Professional Autobiography/Resume-Desi-Miteva-Nikolova-October-2026.docx
@@ -251,17 +251,21 @@
                 <w:rFonts w:ascii="Calibri" w:hAnsi="Calibri" w:eastAsia="Calibri" w:cs="Calibri"/>
                 <w:b w:val="0"/>
                 <w:bCs w:val="0"/>
-                <w:noProof w:val="0"/>
-                <w:sz w:val="20"/>
-                <w:szCs w:val="20"/>
-                <w:lang w:val="en-US"/>
-              </w:rPr>
-            </w:pPr>
-            <w:r>
-              <w:rPr>
-                <w:rFonts w:ascii="Calibri" w:hAnsi="Calibri" w:eastAsia="Calibri" w:cs="Calibri"/>
-                <w:b w:val="0"/>
-                <w:bCs w:val="0"/>
+                <w:i w:val="1"/>
+                <w:iCs w:val="1"/>
+                <w:noProof w:val="0"/>
+                <w:sz w:val="20"/>
+                <w:szCs w:val="20"/>
+                <w:lang w:val="en-US"/>
+              </w:rPr>
+            </w:pPr>
+            <w:r>
+              <w:rPr>
+                <w:rFonts w:ascii="Calibri" w:hAnsi="Calibri" w:eastAsia="Calibri" w:cs="Calibri"/>
+                <w:b w:val="0"/>
+                <w:bCs w:val="0"/>
+                <w:i w:val="1"/>
+                <w:iCs w:val="1"/>
                 <w:noProof w:val="0"/>
                 <w:sz w:val="20"/>
                 <w:szCs w:val="20"/>
@@ -274,6 +278,8 @@
                 <w:rFonts w:ascii="Calibri" w:hAnsi="Calibri" w:eastAsia="Calibri" w:cs="Calibri"/>
                 <w:b w:val="0"/>
                 <w:bCs w:val="0"/>
+                <w:i w:val="1"/>
+                <w:iCs w:val="1"/>
                 <w:noProof w:val="0"/>
                 <w:sz w:val="20"/>
                 <w:szCs w:val="20"/>
@@ -355,12 +361,25 @@
               <w:spacing w:before="0" w:beforeAutospacing="off" w:after="0" w:afterAutospacing="off" w:line="240" w:lineRule="auto"/>
               <w:ind w:left="0" w:right="0"/>
               <w:jc w:val="left"/>
-            </w:pPr>
-            <w:r>
-              <w:rPr>
-                <w:rFonts w:ascii="Calibri" w:hAnsi="Calibri" w:eastAsia="Calibri" w:cs="Calibri"/>
-                <w:b w:val="0"/>
-                <w:bCs w:val="0"/>
+              <w:rPr>
+                <w:rFonts w:ascii="Calibri" w:hAnsi="Calibri" w:eastAsia="Calibri" w:cs="Calibri"/>
+                <w:b w:val="0"/>
+                <w:bCs w:val="0"/>
+                <w:i w:val="1"/>
+                <w:iCs w:val="1"/>
+                <w:noProof w:val="0"/>
+                <w:sz w:val="20"/>
+                <w:szCs w:val="20"/>
+                <w:lang w:val="en-US"/>
+              </w:rPr>
+            </w:pPr>
+            <w:r>
+              <w:rPr>
+                <w:rFonts w:ascii="Calibri" w:hAnsi="Calibri" w:eastAsia="Calibri" w:cs="Calibri"/>
+                <w:b w:val="0"/>
+                <w:bCs w:val="0"/>
+                <w:i w:val="1"/>
+                <w:iCs w:val="1"/>
                 <w:noProof w:val="0"/>
                 <w:sz w:val="20"/>
                 <w:szCs w:val="20"/>
@@ -373,6 +392,8 @@
                 <w:rFonts w:ascii="Calibri" w:hAnsi="Calibri" w:eastAsia="Calibri" w:cs="Calibri"/>
                 <w:b w:val="0"/>
                 <w:bCs w:val="0"/>
+                <w:i w:val="1"/>
+                <w:iCs w:val="1"/>
                 <w:noProof w:val="0"/>
                 <w:sz w:val="20"/>
                 <w:szCs w:val="20"/>
@@ -422,23 +443,53 @@
                 <w:rFonts w:ascii="Calibri" w:hAnsi="Calibri" w:eastAsia="Calibri" w:cs="Calibri"/>
                 <w:b w:val="0"/>
                 <w:bCs w:val="0"/>
-                <w:noProof w:val="0"/>
-                <w:sz w:val="20"/>
-                <w:szCs w:val="20"/>
-                <w:lang w:val="en-US"/>
-              </w:rPr>
-            </w:pPr>
-            <w:r>
-              <w:rPr>
-                <w:rFonts w:ascii="Calibri" w:hAnsi="Calibri" w:eastAsia="Calibri" w:cs="Calibri"/>
-                <w:b w:val="0"/>
-                <w:bCs w:val="0"/>
-                <w:noProof w:val="0"/>
-                <w:sz w:val="20"/>
-                <w:szCs w:val="20"/>
-                <w:lang w:val="en-US"/>
-              </w:rPr>
-              <w:t xml:space="preserve">Master’s Degree Certificate Data Science and Business Analytics </w:t>
+                <w:i w:val="1"/>
+                <w:iCs w:val="1"/>
+                <w:noProof w:val="0"/>
+                <w:sz w:val="20"/>
+                <w:szCs w:val="20"/>
+                <w:lang w:val="en-US"/>
+              </w:rPr>
+            </w:pPr>
+            <w:r>
+              <w:rPr>
+                <w:rFonts w:ascii="Calibri" w:hAnsi="Calibri" w:eastAsia="Calibri" w:cs="Calibri"/>
+                <w:b w:val="0"/>
+                <w:bCs w:val="0"/>
+                <w:i w:val="1"/>
+                <w:iCs w:val="1"/>
+                <w:noProof w:val="0"/>
+                <w:sz w:val="20"/>
+                <w:szCs w:val="20"/>
+                <w:lang w:val="en-US"/>
+              </w:rPr>
+              <w:t xml:space="preserve">Master’s Degree Certificate </w:t>
+            </w:r>
+          </w:p>
+          <w:p>
+            <w:pPr>
+              <w:pStyle w:val="Normal"/>
+              <w:rPr>
+                <w:rFonts w:ascii="Calibri" w:hAnsi="Calibri" w:eastAsia="Calibri" w:cs="Calibri"/>
+                <w:b w:val="0"/>
+                <w:bCs w:val="0"/>
+                <w:noProof w:val="0"/>
+                <w:sz w:val="20"/>
+                <w:szCs w:val="20"/>
+                <w:lang w:val="en-US"/>
+              </w:rPr>
+            </w:pPr>
+            <w:r>
+              <w:rPr>
+                <w:rFonts w:ascii="Calibri" w:hAnsi="Calibri" w:eastAsia="Calibri" w:cs="Calibri"/>
+                <w:b w:val="0"/>
+                <w:bCs w:val="0"/>
+                <w:noProof w:val="0"/>
+                <w:sz w:val="20"/>
+                <w:szCs w:val="20"/>
+                <w:lang w:val="en-US"/>
+              </w:rPr>
+              <w:t xml:space="preserve">Data Science and Business Analytics </w:t>
             </w:r>
           </w:p>
           <w:p>
@@ -540,17 +591,21 @@
                 <w:rFonts w:ascii="Calibri" w:hAnsi="Calibri" w:eastAsia="Calibri" w:cs="Calibri"/>
                 <w:b w:val="0"/>
                 <w:bCs w:val="0"/>
-                <w:noProof w:val="0"/>
-                <w:sz w:val="20"/>
-                <w:szCs w:val="20"/>
-                <w:lang w:val="en-US"/>
-              </w:rPr>
-            </w:pPr>
-            <w:r>
-              <w:rPr>
-                <w:rFonts w:ascii="Calibri" w:hAnsi="Calibri" w:eastAsia="Calibri" w:cs="Calibri"/>
-                <w:b w:val="0"/>
-                <w:bCs w:val="0"/>
+                <w:i w:val="1"/>
+                <w:iCs w:val="1"/>
+                <w:noProof w:val="0"/>
+                <w:sz w:val="20"/>
+                <w:szCs w:val="20"/>
+                <w:lang w:val="en-US"/>
+              </w:rPr>
+            </w:pPr>
+            <w:r>
+              <w:rPr>
+                <w:rFonts w:ascii="Calibri" w:hAnsi="Calibri" w:eastAsia="Calibri" w:cs="Calibri"/>
+                <w:b w:val="0"/>
+                <w:bCs w:val="0"/>
+                <w:i w:val="1"/>
+                <w:iCs w:val="1"/>
                 <w:noProof w:val="0"/>
                 <w:sz w:val="20"/>
                 <w:szCs w:val="20"/>
@@ -645,17 +700,21 @@
                 <w:rFonts w:ascii="Calibri" w:hAnsi="Calibri" w:eastAsia="Calibri" w:cs="Calibri"/>
                 <w:b w:val="0"/>
                 <w:bCs w:val="0"/>
-                <w:noProof w:val="0"/>
-                <w:sz w:val="20"/>
-                <w:szCs w:val="20"/>
-                <w:lang w:val="en-US"/>
-              </w:rPr>
-            </w:pPr>
-            <w:r>
-              <w:rPr>
-                <w:rFonts w:ascii="Calibri" w:hAnsi="Calibri" w:eastAsia="Calibri" w:cs="Calibri"/>
-                <w:b w:val="0"/>
-                <w:bCs w:val="0"/>
+                <w:i w:val="1"/>
+                <w:iCs w:val="1"/>
+                <w:noProof w:val="0"/>
+                <w:sz w:val="20"/>
+                <w:szCs w:val="20"/>
+                <w:lang w:val="en-US"/>
+              </w:rPr>
+            </w:pPr>
+            <w:r>
+              <w:rPr>
+                <w:rFonts w:ascii="Calibri" w:hAnsi="Calibri" w:eastAsia="Calibri" w:cs="Calibri"/>
+                <w:b w:val="0"/>
+                <w:bCs w:val="0"/>
+                <w:i w:val="1"/>
+                <w:iCs w:val="1"/>
                 <w:noProof w:val="0"/>
                 <w:sz w:val="20"/>
                 <w:szCs w:val="20"/>
@@ -667,12 +726,25 @@
           <w:p>
             <w:pPr>
               <w:pStyle w:val="Normal"/>
-            </w:pPr>
-            <w:r>
-              <w:rPr>
-                <w:rFonts w:ascii="Calibri" w:hAnsi="Calibri" w:eastAsia="Calibri" w:cs="Calibri"/>
-                <w:b w:val="0"/>
-                <w:bCs w:val="0"/>
+              <w:rPr>
+                <w:rFonts w:ascii="Calibri" w:hAnsi="Calibri" w:eastAsia="Calibri" w:cs="Calibri"/>
+                <w:b w:val="0"/>
+                <w:bCs w:val="0"/>
+                <w:i w:val="1"/>
+                <w:iCs w:val="1"/>
+                <w:noProof w:val="0"/>
+                <w:sz w:val="20"/>
+                <w:szCs w:val="20"/>
+                <w:lang w:val="en-US"/>
+              </w:rPr>
+            </w:pPr>
+            <w:r>
+              <w:rPr>
+                <w:rFonts w:ascii="Calibri" w:hAnsi="Calibri" w:eastAsia="Calibri" w:cs="Calibri"/>
+                <w:b w:val="0"/>
+                <w:bCs w:val="0"/>
+                <w:i w:val="1"/>
+                <w:iCs w:val="1"/>
                 <w:noProof w:val="0"/>
                 <w:sz w:val="20"/>
                 <w:szCs w:val="20"/>
@@ -688,17 +760,21 @@
                 <w:rFonts w:ascii="Calibri" w:hAnsi="Calibri" w:eastAsia="Calibri" w:cs="Calibri"/>
                 <w:b w:val="0"/>
                 <w:bCs w:val="0"/>
-                <w:noProof w:val="0"/>
-                <w:sz w:val="20"/>
-                <w:szCs w:val="20"/>
-                <w:lang w:val="en-US"/>
-              </w:rPr>
-            </w:pPr>
-            <w:r>
-              <w:rPr>
-                <w:rFonts w:ascii="Calibri" w:hAnsi="Calibri" w:eastAsia="Calibri" w:cs="Calibri"/>
-                <w:b w:val="0"/>
-                <w:bCs w:val="0"/>
+                <w:i w:val="1"/>
+                <w:iCs w:val="1"/>
+                <w:noProof w:val="0"/>
+                <w:sz w:val="20"/>
+                <w:szCs w:val="20"/>
+                <w:lang w:val="en-US"/>
+              </w:rPr>
+            </w:pPr>
+            <w:r>
+              <w:rPr>
+                <w:rFonts w:ascii="Calibri" w:hAnsi="Calibri" w:eastAsia="Calibri" w:cs="Calibri"/>
+                <w:b w:val="0"/>
+                <w:bCs w:val="0"/>
+                <w:i w:val="1"/>
+                <w:iCs w:val="1"/>
                 <w:noProof w:val="0"/>
                 <w:sz w:val="20"/>
                 <w:szCs w:val="20"/>
@@ -714,17 +790,21 @@
                 <w:rFonts w:ascii="Calibri" w:hAnsi="Calibri" w:eastAsia="Calibri" w:cs="Calibri"/>
                 <w:b w:val="0"/>
                 <w:bCs w:val="0"/>
-                <w:noProof w:val="0"/>
-                <w:sz w:val="20"/>
-                <w:szCs w:val="20"/>
-                <w:lang w:val="en-US"/>
-              </w:rPr>
-            </w:pPr>
-            <w:r>
-              <w:rPr>
-                <w:rFonts w:ascii="Calibri" w:hAnsi="Calibri" w:eastAsia="Calibri" w:cs="Calibri"/>
-                <w:b w:val="0"/>
-                <w:bCs w:val="0"/>
+                <w:i w:val="1"/>
+                <w:iCs w:val="1"/>
+                <w:noProof w:val="0"/>
+                <w:sz w:val="20"/>
+                <w:szCs w:val="20"/>
+                <w:lang w:val="en-US"/>
+              </w:rPr>
+            </w:pPr>
+            <w:r>
+              <w:rPr>
+                <w:rFonts w:ascii="Calibri" w:hAnsi="Calibri" w:eastAsia="Calibri" w:cs="Calibri"/>
+                <w:b w:val="0"/>
+                <w:bCs w:val="0"/>
+                <w:i w:val="1"/>
+                <w:iCs w:val="1"/>
                 <w:noProof w:val="0"/>
                 <w:sz w:val="20"/>
                 <w:szCs w:val="20"/>
@@ -764,12 +844,43 @@
                 <w:rFonts w:ascii="Calibri" w:hAnsi="Calibri" w:eastAsia="Calibri" w:cs="Calibri"/>
                 <w:b w:val="0"/>
                 <w:bCs w:val="0"/>
-                <w:noProof w:val="0"/>
-                <w:sz w:val="20"/>
-                <w:szCs w:val="20"/>
-                <w:lang w:val="en-US"/>
-              </w:rPr>
-              <w:t>Graduation mark in Mathematics – 6.0 (A) High School ‘Yordan Yovkov’ 2000</w:t>
+                <w:i w:val="1"/>
+                <w:iCs w:val="1"/>
+                <w:noProof w:val="0"/>
+                <w:sz w:val="20"/>
+                <w:szCs w:val="20"/>
+                <w:lang w:val="en-US"/>
+              </w:rPr>
+              <w:t>Graduation mark in Mathematics – 6.0 (A)</w:t>
+            </w:r>
+            <w:r>
+              <w:rPr>
+                <w:rFonts w:ascii="Calibri" w:hAnsi="Calibri" w:eastAsia="Calibri" w:cs="Calibri"/>
+                <w:b w:val="0"/>
+                <w:bCs w:val="0"/>
+                <w:noProof w:val="0"/>
+                <w:sz w:val="20"/>
+                <w:szCs w:val="20"/>
+                <w:lang w:val="en-US"/>
+              </w:rPr>
+              <w:t xml:space="preserve"> High School ‘Yordan Yovkov’ </w:t>
+            </w:r>
+          </w:p>
+          <w:p>
+            <w:pPr>
+              <w:pStyle w:val="Normal"/>
+            </w:pPr>
+            <w:r>
+              <w:rPr>
+                <w:rFonts w:ascii="Calibri" w:hAnsi="Calibri" w:eastAsia="Calibri" w:cs="Calibri"/>
+                <w:b w:val="0"/>
+                <w:bCs w:val="0"/>
+                <w:noProof w:val="0"/>
+                <w:sz w:val="20"/>
+                <w:szCs w:val="20"/>
+                <w:lang w:val="en-US"/>
+              </w:rPr>
+              <w:t>2000</w:t>
             </w:r>
           </w:p>
         </w:tc>
@@ -1054,7 +1165,7 @@
                 <w:szCs w:val="22"/>
                 <w:lang w:val="en-US"/>
               </w:rPr>
-              <w:t xml:space="preserve">SoftServe Inc., Sliven (Bulgaria) 2024- 2024 </w:t>
+              <w:t xml:space="preserve">SoftServe Inc., Sliven (Bulgaria) 2024-2024 </w:t>
             </w:r>
           </w:p>
           <w:p>
@@ -1410,7 +1521,7 @@
                 <w:szCs w:val="22"/>
                 <w:lang w:val="en-US"/>
               </w:rPr>
-              <w:t xml:space="preserve">Critical Control Technologies, Calgary (Canada) 2023- 2024 </w:t>
+              <w:t xml:space="preserve">Critical Control Technologies, Calgary (Canada) 2023-2024 </w:t>
             </w:r>
           </w:p>
           <w:p>
@@ -1639,7 +1750,24 @@
                 <w:szCs w:val="22"/>
                 <w:lang w:val="en-US"/>
               </w:rPr>
-              <w:t xml:space="preserve">Senior IT Business Analyst, AVP </w:t>
+              <w:t xml:space="preserve">Senior IT Business Analyst, </w:t>
+            </w:r>
+            <w:r>
+              <w:rPr>
+                <w:rFonts w:ascii="Calibri" w:hAnsi="Calibri" w:eastAsia="Calibri" w:cs="Calibri"/>
+                <w:b w:val="1"/>
+                <w:bCs w:val="1"/>
+                <w:i w:val="0"/>
+                <w:iCs w:val="0"/>
+                <w:caps w:val="0"/>
+                <w:smallCaps w:val="0"/>
+                <w:noProof w:val="0"/>
+                <w:color w:val="000000" w:themeColor="text1" w:themeTint="FF" w:themeShade="FF"/>
+                <w:sz w:val="22"/>
+                <w:szCs w:val="22"/>
+                <w:lang w:val="en-US"/>
+              </w:rPr>
+              <w:t>Assistant Vice President (AVP)</w:t>
             </w:r>
           </w:p>
           <w:p>
@@ -1677,7 +1805,7 @@
                 <w:szCs w:val="22"/>
                 <w:lang w:val="en-US"/>
               </w:rPr>
-              <w:t xml:space="preserve">Citigroup Inc., Dublin (Ireland) 2020- 2021 </w:t>
+              <w:t xml:space="preserve">Citigroup Inc., Dublin (Ireland) 2020-2021 </w:t>
             </w:r>
           </w:p>
           <w:p>
@@ -1722,6 +1850,173 @@
             <w:pPr>
               <w:spacing w:before="0" w:after="0" w:line="240" w:lineRule="auto"/>
               <w:jc w:val="both"/>
+            </w:pPr>
+            <w:r>
+              <w:rPr>
+                <w:rFonts w:ascii="Calibri" w:hAnsi="Calibri" w:eastAsia="Calibri" w:cs="Calibri"/>
+                <w:b w:val="0"/>
+                <w:bCs w:val="0"/>
+                <w:i w:val="0"/>
+                <w:iCs w:val="0"/>
+                <w:caps w:val="0"/>
+                <w:smallCaps w:val="0"/>
+                <w:noProof w:val="0"/>
+                <w:color w:val="000000" w:themeColor="text1" w:themeTint="FF" w:themeShade="FF"/>
+                <w:sz w:val="22"/>
+                <w:szCs w:val="22"/>
+                <w:lang w:val="en-US"/>
+              </w:rPr>
+              <w:t xml:space="preserve">• Solving problems related to the computations made by the systems based on SQL procedures. </w:t>
+            </w:r>
+          </w:p>
+          <w:p>
+            <w:pPr>
+              <w:pStyle w:val="Normal"/>
+              <w:spacing w:before="0" w:after="0" w:line="240" w:lineRule="auto"/>
+              <w:jc w:val="both"/>
+            </w:pPr>
+            <w:r>
+              <w:rPr>
+                <w:rFonts w:ascii="Calibri" w:hAnsi="Calibri" w:eastAsia="Calibri" w:cs="Calibri"/>
+                <w:b w:val="0"/>
+                <w:bCs w:val="0"/>
+                <w:i w:val="0"/>
+                <w:iCs w:val="0"/>
+                <w:caps w:val="0"/>
+                <w:smallCaps w:val="0"/>
+                <w:noProof w:val="0"/>
+                <w:color w:val="000000" w:themeColor="text1" w:themeTint="FF" w:themeShade="FF"/>
+                <w:sz w:val="22"/>
+                <w:szCs w:val="22"/>
+                <w:lang w:val="en-US"/>
+              </w:rPr>
+              <w:t xml:space="preserve">• </w:t>
+            </w:r>
+            <w:r>
+              <w:rPr>
+                <w:rFonts w:ascii="Calibri" w:hAnsi="Calibri" w:eastAsia="Calibri" w:cs="Calibri"/>
+                <w:b w:val="0"/>
+                <w:bCs w:val="0"/>
+                <w:i w:val="0"/>
+                <w:iCs w:val="0"/>
+                <w:caps w:val="0"/>
+                <w:smallCaps w:val="0"/>
+                <w:noProof w:val="0"/>
+                <w:color w:val="000000" w:themeColor="text1" w:themeTint="FF" w:themeShade="FF"/>
+                <w:sz w:val="22"/>
+                <w:szCs w:val="22"/>
+                <w:lang w:val="en-US"/>
+              </w:rPr>
+              <w:t xml:space="preserve">Gathering systems requirements and </w:t>
+            </w:r>
+            <w:r>
+              <w:rPr>
+                <w:rFonts w:ascii="Calibri" w:hAnsi="Calibri" w:eastAsia="Calibri" w:cs="Calibri"/>
+                <w:b w:val="0"/>
+                <w:bCs w:val="0"/>
+                <w:i w:val="0"/>
+                <w:iCs w:val="0"/>
+                <w:caps w:val="0"/>
+                <w:smallCaps w:val="0"/>
+                <w:noProof w:val="0"/>
+                <w:color w:val="000000" w:themeColor="text1" w:themeTint="FF" w:themeShade="FF"/>
+                <w:sz w:val="22"/>
+                <w:szCs w:val="22"/>
+                <w:lang w:val="en-US"/>
+              </w:rPr>
+              <w:t>assisting</w:t>
+            </w:r>
+            <w:r>
+              <w:rPr>
+                <w:rFonts w:ascii="Calibri" w:hAnsi="Calibri" w:eastAsia="Calibri" w:cs="Calibri"/>
+                <w:b w:val="0"/>
+                <w:bCs w:val="0"/>
+                <w:i w:val="0"/>
+                <w:iCs w:val="0"/>
+                <w:caps w:val="0"/>
+                <w:smallCaps w:val="0"/>
+                <w:noProof w:val="0"/>
+                <w:color w:val="000000" w:themeColor="text1" w:themeTint="FF" w:themeShade="FF"/>
+                <w:sz w:val="22"/>
+                <w:szCs w:val="22"/>
+                <w:lang w:val="en-US"/>
+              </w:rPr>
+              <w:t xml:space="preserve"> in the development of </w:t>
+            </w:r>
+            <w:r>
+              <w:rPr>
+                <w:rFonts w:ascii="Calibri" w:hAnsi="Calibri" w:eastAsia="Calibri" w:cs="Calibri"/>
+                <w:b w:val="0"/>
+                <w:bCs w:val="0"/>
+                <w:i w:val="0"/>
+                <w:iCs w:val="0"/>
+                <w:caps w:val="0"/>
+                <w:smallCaps w:val="0"/>
+                <w:noProof w:val="0"/>
+                <w:color w:val="000000" w:themeColor="text1" w:themeTint="FF" w:themeShade="FF"/>
+                <w:sz w:val="22"/>
+                <w:szCs w:val="22"/>
+                <w:lang w:val="en-US"/>
+              </w:rPr>
+              <w:t>business requirements documents (</w:t>
+            </w:r>
+            <w:r>
+              <w:rPr>
+                <w:rFonts w:ascii="Calibri" w:hAnsi="Calibri" w:eastAsia="Calibri" w:cs="Calibri"/>
+                <w:b w:val="0"/>
+                <w:bCs w:val="0"/>
+                <w:i w:val="0"/>
+                <w:iCs w:val="0"/>
+                <w:caps w:val="0"/>
+                <w:smallCaps w:val="0"/>
+                <w:noProof w:val="0"/>
+                <w:color w:val="000000" w:themeColor="text1" w:themeTint="FF" w:themeShade="FF"/>
+                <w:sz w:val="22"/>
+                <w:szCs w:val="22"/>
+                <w:lang w:val="en-US"/>
+              </w:rPr>
+              <w:t>BRDs</w:t>
+            </w:r>
+            <w:r>
+              <w:rPr>
+                <w:rFonts w:ascii="Calibri" w:hAnsi="Calibri" w:eastAsia="Calibri" w:cs="Calibri"/>
+                <w:b w:val="0"/>
+                <w:bCs w:val="0"/>
+                <w:i w:val="0"/>
+                <w:iCs w:val="0"/>
+                <w:caps w:val="0"/>
+                <w:smallCaps w:val="0"/>
+                <w:noProof w:val="0"/>
+                <w:color w:val="000000" w:themeColor="text1" w:themeTint="FF" w:themeShade="FF"/>
+                <w:sz w:val="22"/>
+                <w:szCs w:val="22"/>
+                <w:lang w:val="en-US"/>
+              </w:rPr>
+              <w:t xml:space="preserve">) </w:t>
+            </w:r>
+            <w:r>
+              <w:rPr>
+                <w:rFonts w:ascii="Calibri" w:hAnsi="Calibri" w:eastAsia="Calibri" w:cs="Calibri"/>
+                <w:b w:val="0"/>
+                <w:bCs w:val="0"/>
+                <w:i w:val="0"/>
+                <w:iCs w:val="0"/>
+                <w:caps w:val="0"/>
+                <w:smallCaps w:val="0"/>
+                <w:noProof w:val="0"/>
+                <w:color w:val="000000" w:themeColor="text1" w:themeTint="FF" w:themeShade="FF"/>
+                <w:sz w:val="22"/>
+                <w:szCs w:val="22"/>
+                <w:lang w:val="en-US"/>
+              </w:rPr>
+              <w:t xml:space="preserve">and project plans. </w:t>
+            </w:r>
+          </w:p>
+          <w:p>
+            <w:pPr>
+              <w:pStyle w:val="Normal"/>
+              <w:spacing w:before="0" w:after="0" w:line="240" w:lineRule="auto"/>
+              <w:jc w:val="both"/>
               <w:rPr>
                 <w:rFonts w:ascii="Calibri" w:hAnsi="Calibri" w:eastAsia="Calibri" w:cs="Calibri"/>
                 <w:b w:val="0"/>
@@ -1753,7 +2048,7 @@
                 <w:szCs w:val="22"/>
                 <w:lang w:val="en-US"/>
               </w:rPr>
-              <w:t xml:space="preserve">• Solving problems related to the computations made by the systems based on SQL procedures. Gathering systems requirements and assisting in the development of BRDs and project plans. </w:t>
+              <w:t xml:space="preserve">• </w:t>
             </w:r>
             <w:r>
               <w:rPr>

</xml_diff>